<commit_message>
Update documentation with NOT NULL and cardinalities
</commit_message>
<xml_diff>
--- a/DB_Yuliyana_Mravova_HW_Ecommerce_descriptions.docx
+++ b/DB_Yuliyana_Mravova_HW_Ecommerce_descriptions.docx
@@ -1746,13 +1746,16 @@
     <w:p>
       <w:pPr>
         <w:pStyle w:val="BodyText"/>
+        <w:rPr>
+          <w:lang w:val="bg-BG"/>
+        </w:rPr>
       </w:pPr>
       <w:r>
         <w:rPr>
           <w:noProof/>
         </w:rPr>
         <w:drawing>
-          <wp:inline distT="0" distB="0" distL="0" distR="0" wp14:anchorId="073DB85E" wp14:editId="365AE6AE">
+          <wp:inline distT="0" distB="0" distL="0" distR="0" wp14:anchorId="073DB85E" wp14:editId="336920AC">
             <wp:extent cx="5939790" cy="3151505"/>
             <wp:effectExtent l="0" t="0" r="3810" b="0"/>
             <wp:docPr id="1795573936" name="Picture 4"/>
@@ -1806,6 +1809,105 @@
         <w:pStyle w:val="BodyText"/>
       </w:pPr>
       <w:r>
+        <w:t>Relations and Cardinalities Description:</w:t>
+      </w:r>
+    </w:p>
+    <w:p>
+      <w:pPr>
+        <w:pStyle w:val="BodyText"/>
+        <w:numPr>
+          <w:ilvl w:val="0"/>
+          <w:numId w:val="33"/>
+        </w:numPr>
+      </w:pPr>
+      <w:r>
+        <w:t>Buyers to Orders(1 to 0…N) – A buyer can place zero or multiple orders, but an order must belong to exactly one buyer.</w:t>
+      </w:r>
+    </w:p>
+    <w:p>
+      <w:pPr>
+        <w:pStyle w:val="BodyText"/>
+        <w:numPr>
+          <w:ilvl w:val="0"/>
+          <w:numId w:val="33"/>
+        </w:numPr>
+      </w:pPr>
+      <w:r>
+        <w:t>Sellers to Products(1 to 0…N) – A seller can list multiple products, but a product must be listed by exactly one seller</w:t>
+      </w:r>
+    </w:p>
+    <w:p>
+      <w:pPr>
+        <w:pStyle w:val="BodyText"/>
+        <w:numPr>
+          <w:ilvl w:val="0"/>
+          <w:numId w:val="33"/>
+        </w:numPr>
+      </w:pPr>
+      <w:r>
+        <w:t>Product_Category to Products(1 to 0…N): A category can contain multiple products, but a product belongs to exactly one category</w:t>
+      </w:r>
+    </w:p>
+    <w:p>
+      <w:pPr>
+        <w:pStyle w:val="BodyText"/>
+        <w:numPr>
+          <w:ilvl w:val="0"/>
+          <w:numId w:val="33"/>
+        </w:numPr>
+      </w:pPr>
+      <w:r>
+        <w:t>Orders to Order_Items to Products(M:N) – an order contains 1…N items. A product can appear in 0…N order items. The bridge table connects them.</w:t>
+      </w:r>
+    </w:p>
+    <w:p>
+      <w:pPr>
+        <w:pStyle w:val="BodyText"/>
+        <w:numPr>
+          <w:ilvl w:val="0"/>
+          <w:numId w:val="33"/>
+        </w:numPr>
+      </w:pPr>
+      <w:r>
+        <w:t>Orders to Payments(1 to 0…N) – An order can have multiple payment attempts, but a payment belongs to exactly one order</w:t>
+      </w:r>
+    </w:p>
+    <w:p>
+      <w:pPr>
+        <w:pStyle w:val="BodyText"/>
+        <w:numPr>
+          <w:ilvl w:val="0"/>
+          <w:numId w:val="33"/>
+        </w:numPr>
+      </w:pPr>
+      <w:r>
+        <w:t>Orders to Deliveries(1 to 1…N) – An order can have multiple delivery status updates over time, but a delivery record belongs to exactly one order</w:t>
+      </w:r>
+    </w:p>
+    <w:p>
+      <w:pPr>
+        <w:pStyle w:val="BodyText"/>
+        <w:numPr>
+          <w:ilvl w:val="0"/>
+          <w:numId w:val="33"/>
+        </w:numPr>
+      </w:pPr>
+      <w:r>
+        <w:lastRenderedPageBreak/>
+        <w:t>Reviews to Product</w:t>
+      </w:r>
+      <w:r>
+        <w:t>s/Buyers</w:t>
+      </w:r>
+      <w:r>
+        <w:t>(0…N to 1) – A product can have 0…N reviews, and a buyer can write 0…N reviews, but a single review always belongs to exactly 1 product and 1 buyer</w:t>
+      </w:r>
+    </w:p>
+    <w:p>
+      <w:pPr>
+        <w:pStyle w:val="BodyText"/>
+      </w:pPr>
+      <w:r>
         <w:t>Answer following questions:</w:t>
       </w:r>
     </w:p>
@@ -1875,7 +1977,6 @@
         </w:numPr>
       </w:pPr>
       <w:r>
-        <w:lastRenderedPageBreak/>
         <w:t>With the implementation of the 3</w:t>
       </w:r>
       <w:r>
@@ -2288,6 +2389,9 @@
             <w:r>
               <w:t>INT, SERIAL</w:t>
             </w:r>
+            <w:r>
+              <w:t>(UNIQUE, NOT NULL)</w:t>
+            </w:r>
           </w:p>
         </w:tc>
       </w:tr>
@@ -2346,6 +2450,9 @@
             <w:r>
               <w:t>(50)</w:t>
             </w:r>
+            <w:r>
+              <w:t>, NOT NULL</w:t>
+            </w:r>
           </w:p>
         </w:tc>
       </w:tr>
@@ -2403,6 +2510,9 @@
             </w:r>
             <w:r>
               <w:t>(50)</w:t>
+            </w:r>
+            <w:r>
+              <w:t>, NOT NULL</w:t>
             </w:r>
           </w:p>
         </w:tc>
@@ -3229,6 +3339,7 @@
           </w:p>
           <w:p>
             <w:r>
+              <w:lastRenderedPageBreak/>
               <w:t>buyers</w:t>
             </w:r>
           </w:p>
@@ -3242,6 +3353,7 @@
               <w:pStyle w:val="BodyText"/>
             </w:pPr>
             <w:r>
+              <w:lastRenderedPageBreak/>
               <w:t>buyer_id</w:t>
             </w:r>
           </w:p>
@@ -3269,6 +3381,9 @@
             </w:pPr>
             <w:r>
               <w:t>INT, SERIAL</w:t>
+            </w:r>
+            <w:r>
+              <w:t>(UNIQUE, NOT NULL)</w:t>
             </w:r>
           </w:p>
         </w:tc>
@@ -3328,6 +3443,9 @@
             <w:r>
               <w:t>VARCHAR(50)</w:t>
             </w:r>
+            <w:r>
+              <w:t>, NOT NULL</w:t>
+            </w:r>
           </w:p>
         </w:tc>
       </w:tr>
@@ -3385,6 +3503,12 @@
             </w:pPr>
             <w:r>
               <w:t>VARCHAR(50)</w:t>
+            </w:r>
+            <w:r>
+              <w:t xml:space="preserve">, </w:t>
+            </w:r>
+            <w:r>
+              <w:t>NOT NULL</w:t>
             </w:r>
           </w:p>
         </w:tc>
@@ -3699,7 +3823,6 @@
               <w:pStyle w:val="BodyText"/>
             </w:pPr>
             <w:r>
-              <w:lastRenderedPageBreak/>
               <w:t xml:space="preserve"> 1</w:t>
             </w:r>
           </w:p>
@@ -4161,6 +4284,9 @@
             <w:r>
               <w:t>NT, SERIAL</w:t>
             </w:r>
+            <w:r>
+              <w:t>(UNIQUE, NOT NULL)</w:t>
+            </w:r>
           </w:p>
         </w:tc>
       </w:tr>
@@ -4215,6 +4341,15 @@
             </w:pPr>
             <w:r>
               <w:t>VARCHAR(100)</w:t>
+            </w:r>
+            <w:r>
+              <w:t xml:space="preserve">, </w:t>
+            </w:r>
+            <w:r>
+              <w:t>NOT NULL</w:t>
+            </w:r>
+            <w:r>
+              <w:t>, UNIQUE</w:t>
             </w:r>
           </w:p>
         </w:tc>
@@ -4478,7 +4613,6 @@
         </w:numPr>
       </w:pPr>
       <w:r>
-        <w:lastRenderedPageBreak/>
         <w:t>Are there partial or transitive dependencies? How did you eliminate them?</w:t>
       </w:r>
       <w:r>
@@ -4712,6 +4846,9 @@
             <w:r>
               <w:t>INT, SERIAL</w:t>
             </w:r>
+            <w:r>
+              <w:t>(UNIQUE, NOT NULL)</w:t>
+            </w:r>
           </w:p>
         </w:tc>
       </w:tr>
@@ -4767,6 +4904,9 @@
             <w:r>
               <w:t>INT</w:t>
             </w:r>
+            <w:r>
+              <w:t>, NOT NULL</w:t>
+            </w:r>
           </w:p>
         </w:tc>
       </w:tr>
@@ -4822,6 +4962,9 @@
             <w:r>
               <w:t>INT</w:t>
             </w:r>
+            <w:r>
+              <w:t>, NOT NULL</w:t>
+            </w:r>
           </w:p>
         </w:tc>
       </w:tr>
@@ -4931,6 +5074,9 @@
             </w:pPr>
             <w:r>
               <w:t>NUMERIC(10,2)</w:t>
+            </w:r>
+            <w:r>
+              <w:t>, NOT NULL</w:t>
             </w:r>
           </w:p>
         </w:tc>
@@ -5319,6 +5465,7 @@
         </w:numPr>
       </w:pPr>
       <w:r>
+        <w:lastRenderedPageBreak/>
         <w:t xml:space="preserve">What is the normalization level of </w:t>
       </w:r>
       <w:r>
@@ -5588,6 +5735,9 @@
             <w:r>
               <w:t>INT, SERIAL</w:t>
             </w:r>
+            <w:r>
+              <w:t>(UNIQUE, NOT NULL)</w:t>
+            </w:r>
           </w:p>
         </w:tc>
       </w:tr>
@@ -5643,6 +5793,9 @@
             <w:r>
               <w:t>INT</w:t>
             </w:r>
+            <w:r>
+              <w:t>, NOT NULL</w:t>
+            </w:r>
           </w:p>
         </w:tc>
       </w:tr>
@@ -5698,6 +5851,9 @@
             <w:r>
               <w:t>INT</w:t>
             </w:r>
+            <w:r>
+              <w:t>, NOT NULL</w:t>
+            </w:r>
           </w:p>
         </w:tc>
       </w:tr>
@@ -5752,6 +5908,9 @@
             </w:pPr>
             <w:r>
               <w:t>TIMESTAMP</w:t>
+            </w:r>
+            <w:r>
+              <w:t>(With a DEFAULT CURRENT_TIMESTAMP)</w:t>
             </w:r>
           </w:p>
         </w:tc>
@@ -6198,6 +6357,7 @@
                 <w:sz w:val="18"/>
                 <w:szCs w:val="18"/>
               </w:rPr>
+              <w:lastRenderedPageBreak/>
               <w:t>Table Name</w:t>
             </w:r>
           </w:p>
@@ -6346,7 +6506,7 @@
               <w:t>INT</w:t>
             </w:r>
             <w:r>
-              <w:tab/>
+              <w:t>(UNIQUE, NOT NULL)</w:t>
             </w:r>
           </w:p>
         </w:tc>
@@ -6399,9 +6559,18 @@
           <w:p>
             <w:pPr>
               <w:pStyle w:val="BodyText"/>
+              <w:rPr>
+                <w:lang w:val="bg-BG"/>
+              </w:rPr>
             </w:pPr>
             <w:r>
               <w:t>INT</w:t>
+            </w:r>
+            <w:r>
+              <w:t xml:space="preserve">, </w:t>
+            </w:r>
+            <w:r>
+              <w:t>NOT NULL</w:t>
             </w:r>
           </w:p>
         </w:tc>
@@ -6457,6 +6626,9 @@
             </w:pPr>
             <w:r>
               <w:t>TIMESTAMP</w:t>
+            </w:r>
+            <w:r>
+              <w:t>(DEFAULT CURRENT_TIMESTAMP)</w:t>
             </w:r>
           </w:p>
         </w:tc>
@@ -6527,7 +6699,6 @@
                 <w:sz w:val="18"/>
                 <w:szCs w:val="18"/>
               </w:rPr>
-              <w:lastRenderedPageBreak/>
               <w:t>order_id</w:t>
             </w:r>
           </w:p>
@@ -6987,6 +7158,9 @@
             <w:r>
               <w:t>INT</w:t>
             </w:r>
+            <w:r>
+              <w:t>, NOT NULL</w:t>
+            </w:r>
           </w:p>
         </w:tc>
       </w:tr>
@@ -7042,6 +7216,9 @@
             <w:r>
               <w:t>INT</w:t>
             </w:r>
+            <w:r>
+              <w:t>, NOT NULL</w:t>
+            </w:r>
           </w:p>
         </w:tc>
       </w:tr>
@@ -7097,6 +7274,9 @@
             <w:r>
               <w:t>INT</w:t>
             </w:r>
+            <w:r>
+              <w:t>, NOT NULL</w:t>
+            </w:r>
           </w:p>
         </w:tc>
       </w:tr>
@@ -7151,6 +7331,9 @@
             </w:pPr>
             <w:r>
               <w:t>NUMERIC(10, 2)</w:t>
+            </w:r>
+            <w:r>
+              <w:t>, NOT NULL</w:t>
             </w:r>
           </w:p>
         </w:tc>
@@ -7220,6 +7403,7 @@
               <w:rPr>
                 <w:color w:val="FFFFFF" w:themeColor="background1"/>
               </w:rPr>
+              <w:lastRenderedPageBreak/>
               <w:t>order_id</w:t>
             </w:r>
           </w:p>
@@ -7469,7 +7653,6 @@
         </w:numPr>
       </w:pPr>
       <w:r>
-        <w:lastRenderedPageBreak/>
         <w:t>Why must this information be stored separately instead of inside another table?</w:t>
       </w:r>
       <w:r>
@@ -7766,6 +7949,9 @@
             <w:r>
               <w:t>INT, SERIAL</w:t>
             </w:r>
+            <w:r>
+              <w:t>(UNIQUE, NOT NULL)</w:t>
+            </w:r>
           </w:p>
         </w:tc>
       </w:tr>
@@ -7821,6 +8007,9 @@
             <w:r>
               <w:t>INT</w:t>
             </w:r>
+            <w:r>
+              <w:t>, NOT NULL</w:t>
+            </w:r>
           </w:p>
         </w:tc>
       </w:tr>
@@ -7876,6 +8065,9 @@
             <w:r>
               <w:t>NUMERIC(10, 2)</w:t>
             </w:r>
+            <w:r>
+              <w:t>, NOT NULL</w:t>
+            </w:r>
           </w:p>
         </w:tc>
       </w:tr>
@@ -7931,6 +8123,9 @@
             <w:r>
               <w:t>TIMESTAMP</w:t>
             </w:r>
+            <w:r>
+              <w:t>(DEFAULT CURRENT_TIMESTAMP)</w:t>
+            </w:r>
           </w:p>
         </w:tc>
       </w:tr>
@@ -7985,6 +8180,9 @@
             </w:pPr>
             <w:r>
               <w:t>VARCHAR(50)</w:t>
+            </w:r>
+            <w:r>
+              <w:t>, NOT NULL</w:t>
             </w:r>
           </w:p>
         </w:tc>
@@ -8338,6 +8536,7 @@
         </w:numPr>
       </w:pPr>
       <w:r>
+        <w:lastRenderedPageBreak/>
         <w:t>What real-world concept or event does this table represent?</w:t>
       </w:r>
       <w:r>
@@ -8425,7 +8624,6 @@
         </w:numPr>
       </w:pPr>
       <w:r>
-        <w:lastRenderedPageBreak/>
         <w:t>Why did you choose this primary key (PK) for the table? Could a composite key work instead? Which foreign keys (FK) did you add and why?</w:t>
       </w:r>
       <w:r>
@@ -8624,6 +8822,9 @@
             <w:r>
               <w:t>INT, SERIAL</w:t>
             </w:r>
+            <w:r>
+              <w:t>(UNIQUE, NOT NULL)</w:t>
+            </w:r>
           </w:p>
         </w:tc>
       </w:tr>
@@ -8679,6 +8880,9 @@
             <w:r>
               <w:t>INT</w:t>
             </w:r>
+            <w:r>
+              <w:t>, NOT NULL</w:t>
+            </w:r>
           </w:p>
         </w:tc>
       </w:tr>
@@ -8734,6 +8938,9 @@
             <w:r>
               <w:t>VARCHAR(50)</w:t>
             </w:r>
+            <w:r>
+              <w:t>, NOT NULL</w:t>
+            </w:r>
           </w:p>
         </w:tc>
       </w:tr>
@@ -8788,6 +8995,9 @@
             </w:pPr>
             <w:r>
               <w:t>TIMESTAMP</w:t>
+            </w:r>
+            <w:r>
+              <w:t>(DEFAULT CURRENT_TIMESTAMP)</w:t>
             </w:r>
           </w:p>
         </w:tc>
@@ -9163,6 +9373,7 @@
         </w:numPr>
       </w:pPr>
       <w:r>
+        <w:lastRenderedPageBreak/>
         <w:t>Why did you choose this primary key (PK) for the table? Could a composite key work instead? Which foreign keys (FK) did you add and why?</w:t>
       </w:r>
       <w:r>
@@ -9366,6 +9577,9 @@
             <w:r>
               <w:t>INT, SERIAL</w:t>
             </w:r>
+            <w:r>
+              <w:t>(UNIQUE, NOT NULL)</w:t>
+            </w:r>
           </w:p>
         </w:tc>
       </w:tr>
@@ -9421,6 +9635,9 @@
             <w:r>
               <w:t>INT</w:t>
             </w:r>
+            <w:r>
+              <w:t>, NOT NULL</w:t>
+            </w:r>
           </w:p>
         </w:tc>
       </w:tr>
@@ -9476,6 +9693,9 @@
             <w:r>
               <w:t>INT</w:t>
             </w:r>
+            <w:r>
+              <w:t>, NOT NULL</w:t>
+            </w:r>
           </w:p>
         </w:tc>
       </w:tr>
@@ -9531,6 +9751,12 @@
             <w:r>
               <w:t>INT</w:t>
             </w:r>
+            <w:r>
+              <w:t>,</w:t>
+            </w:r>
+            <w:r>
+              <w:t xml:space="preserve"> NOT NULL</w:t>
+            </w:r>
           </w:p>
         </w:tc>
       </w:tr>
@@ -9640,6 +9866,9 @@
             </w:pPr>
             <w:r>
               <w:t>TIMESTAMP</w:t>
+            </w:r>
+            <w:r>
+              <w:t>(DEFAULT CURRENT_TIMESTAMP)</w:t>
             </w:r>
           </w:p>
         </w:tc>
@@ -10278,6 +10507,7 @@
               </w:rPr>
             </w:pPr>
             <w:r>
+              <w:lastRenderedPageBreak/>
               <w:t xml:space="preserve"> discounts</w:t>
             </w:r>
           </w:p>
@@ -10318,6 +10548,9 @@
             </w:pPr>
             <w:r>
               <w:t>INT, SERIAL</w:t>
+            </w:r>
+            <w:r>
+              <w:t>(UNIQUE, NOT NULL)</w:t>
             </w:r>
           </w:p>
         </w:tc>
@@ -10374,6 +10607,9 @@
             <w:r>
               <w:t>INT</w:t>
             </w:r>
+            <w:r>
+              <w:t>, NOT NULL</w:t>
+            </w:r>
           </w:p>
         </w:tc>
       </w:tr>
@@ -10429,6 +10665,9 @@
             <w:r>
               <w:t>NUMERIC(10, 2)</w:t>
             </w:r>
+            <w:r>
+              <w:t>, NOT NULL</w:t>
+            </w:r>
           </w:p>
         </w:tc>
       </w:tr>
@@ -10484,6 +10723,9 @@
             <w:r>
               <w:t>TIMESTAMP</w:t>
             </w:r>
+            <w:r>
+              <w:t>, NOT NULL</w:t>
+            </w:r>
           </w:p>
         </w:tc>
       </w:tr>
@@ -10538,6 +10780,9 @@
             </w:pPr>
             <w:r>
               <w:t>TIMESTAMP</w:t>
+            </w:r>
+            <w:r>
+              <w:t>, NOT NULL</w:t>
             </w:r>
           </w:p>
         </w:tc>
@@ -10608,7 +10853,6 @@
               <w:rPr>
                 <w:color w:val="FFFFFF" w:themeColor="background1"/>
               </w:rPr>
-              <w:lastRenderedPageBreak/>
               <w:t>discount_id</w:t>
             </w:r>
           </w:p>
@@ -11164,6 +11408,9 @@
             <w:r>
               <w:t>INT, SERIAL</w:t>
             </w:r>
+            <w:r>
+              <w:t>(UNIQUE, NOT NULL)</w:t>
+            </w:r>
           </w:p>
         </w:tc>
       </w:tr>
@@ -11219,6 +11466,9 @@
             <w:r>
               <w:t>INT</w:t>
             </w:r>
+            <w:r>
+              <w:t>, NOT NULL</w:t>
+            </w:r>
           </w:p>
         </w:tc>
       </w:tr>
@@ -11277,6 +11527,9 @@
             <w:r>
               <w:t>NUMERIC(5, 2)</w:t>
             </w:r>
+            <w:r>
+              <w:t>, NOT NULL</w:t>
+            </w:r>
           </w:p>
         </w:tc>
       </w:tr>
@@ -11332,6 +11585,9 @@
             <w:r>
               <w:t>TIMESTAMP</w:t>
             </w:r>
+            <w:r>
+              <w:t>, NOT NULL</w:t>
+            </w:r>
           </w:p>
         </w:tc>
       </w:tr>
@@ -11386,6 +11642,9 @@
             </w:pPr>
             <w:r>
               <w:t>TIMESTAMP</w:t>
+            </w:r>
+            <w:r>
+              <w:t>, NOT NULL</w:t>
             </w:r>
           </w:p>
         </w:tc>
@@ -11690,16 +11949,6 @@
         </w:tc>
       </w:tr>
     </w:tbl>
-    <w:p>
-      <w:pPr>
-        <w:pStyle w:val="BodyText"/>
-      </w:pPr>
-    </w:p>
-    <w:p>
-      <w:pPr>
-        <w:pStyle w:val="BodyText"/>
-      </w:pPr>
-    </w:p>
     <w:p>
       <w:pPr>
         <w:pStyle w:val="BodyText"/>
@@ -14633,6 +14882,119 @@
     </w:lvl>
   </w:abstractNum>
   <w:abstractNum w:abstractNumId="22" w15:restartNumberingAfterBreak="0">
+    <w:nsid w:val="65F3590A"/>
+    <w:multiLevelType w:val="hybridMultilevel"/>
+    <w:tmpl w:val="442CAA6C"/>
+    <w:lvl w:ilvl="0" w:tplc="04090001">
+      <w:start w:val="1"/>
+      <w:numFmt w:val="bullet"/>
+      <w:lvlText w:val=""/>
+      <w:lvlJc w:val="left"/>
+      <w:pPr>
+        <w:ind w:left="720" w:hanging="360"/>
+      </w:pPr>
+      <w:rPr>
+        <w:rFonts w:ascii="Symbol" w:hAnsi="Symbol" w:hint="default"/>
+      </w:rPr>
+    </w:lvl>
+    <w:lvl w:ilvl="1" w:tplc="04090003" w:tentative="1">
+      <w:start w:val="1"/>
+      <w:numFmt w:val="bullet"/>
+      <w:lvlText w:val="o"/>
+      <w:lvlJc w:val="left"/>
+      <w:pPr>
+        <w:ind w:left="1440" w:hanging="360"/>
+      </w:pPr>
+      <w:rPr>
+        <w:rFonts w:ascii="Courier New" w:hAnsi="Courier New" w:cs="Courier New" w:hint="default"/>
+      </w:rPr>
+    </w:lvl>
+    <w:lvl w:ilvl="2" w:tplc="04090005" w:tentative="1">
+      <w:start w:val="1"/>
+      <w:numFmt w:val="bullet"/>
+      <w:lvlText w:val=""/>
+      <w:lvlJc w:val="left"/>
+      <w:pPr>
+        <w:ind w:left="2160" w:hanging="360"/>
+      </w:pPr>
+      <w:rPr>
+        <w:rFonts w:ascii="Wingdings" w:hAnsi="Wingdings" w:hint="default"/>
+      </w:rPr>
+    </w:lvl>
+    <w:lvl w:ilvl="3" w:tplc="04090001" w:tentative="1">
+      <w:start w:val="1"/>
+      <w:numFmt w:val="bullet"/>
+      <w:lvlText w:val=""/>
+      <w:lvlJc w:val="left"/>
+      <w:pPr>
+        <w:ind w:left="2880" w:hanging="360"/>
+      </w:pPr>
+      <w:rPr>
+        <w:rFonts w:ascii="Symbol" w:hAnsi="Symbol" w:hint="default"/>
+      </w:rPr>
+    </w:lvl>
+    <w:lvl w:ilvl="4" w:tplc="04090003" w:tentative="1">
+      <w:start w:val="1"/>
+      <w:numFmt w:val="bullet"/>
+      <w:lvlText w:val="o"/>
+      <w:lvlJc w:val="left"/>
+      <w:pPr>
+        <w:ind w:left="3600" w:hanging="360"/>
+      </w:pPr>
+      <w:rPr>
+        <w:rFonts w:ascii="Courier New" w:hAnsi="Courier New" w:cs="Courier New" w:hint="default"/>
+      </w:rPr>
+    </w:lvl>
+    <w:lvl w:ilvl="5" w:tplc="04090005" w:tentative="1">
+      <w:start w:val="1"/>
+      <w:numFmt w:val="bullet"/>
+      <w:lvlText w:val=""/>
+      <w:lvlJc w:val="left"/>
+      <w:pPr>
+        <w:ind w:left="4320" w:hanging="360"/>
+      </w:pPr>
+      <w:rPr>
+        <w:rFonts w:ascii="Wingdings" w:hAnsi="Wingdings" w:hint="default"/>
+      </w:rPr>
+    </w:lvl>
+    <w:lvl w:ilvl="6" w:tplc="04090001" w:tentative="1">
+      <w:start w:val="1"/>
+      <w:numFmt w:val="bullet"/>
+      <w:lvlText w:val=""/>
+      <w:lvlJc w:val="left"/>
+      <w:pPr>
+        <w:ind w:left="5040" w:hanging="360"/>
+      </w:pPr>
+      <w:rPr>
+        <w:rFonts w:ascii="Symbol" w:hAnsi="Symbol" w:hint="default"/>
+      </w:rPr>
+    </w:lvl>
+    <w:lvl w:ilvl="7" w:tplc="04090003" w:tentative="1">
+      <w:start w:val="1"/>
+      <w:numFmt w:val="bullet"/>
+      <w:lvlText w:val="o"/>
+      <w:lvlJc w:val="left"/>
+      <w:pPr>
+        <w:ind w:left="5760" w:hanging="360"/>
+      </w:pPr>
+      <w:rPr>
+        <w:rFonts w:ascii="Courier New" w:hAnsi="Courier New" w:cs="Courier New" w:hint="default"/>
+      </w:rPr>
+    </w:lvl>
+    <w:lvl w:ilvl="8" w:tplc="04090005" w:tentative="1">
+      <w:start w:val="1"/>
+      <w:numFmt w:val="bullet"/>
+      <w:lvlText w:val=""/>
+      <w:lvlJc w:val="left"/>
+      <w:pPr>
+        <w:ind w:left="6480" w:hanging="360"/>
+      </w:pPr>
+      <w:rPr>
+        <w:rFonts w:ascii="Wingdings" w:hAnsi="Wingdings" w:hint="default"/>
+      </w:rPr>
+    </w:lvl>
+  </w:abstractNum>
+  <w:abstractNum w:abstractNumId="23" w15:restartNumberingAfterBreak="0">
     <w:nsid w:val="7ECA4DDE"/>
     <w:multiLevelType w:val="hybridMultilevel"/>
     <w:tmpl w:val="220478B4"/>
@@ -14737,7 +15099,7 @@
     <w:abstractNumId w:val="5"/>
   </w:num>
   <w:num w:numId="7" w16cid:durableId="1345595060">
-    <w:abstractNumId w:val="22"/>
+    <w:abstractNumId w:val="23"/>
   </w:num>
   <w:num w:numId="8" w16cid:durableId="743599848">
     <w:abstractNumId w:val="14"/>
@@ -14945,6 +15307,9 @@
   </w:num>
   <w:num w:numId="32" w16cid:durableId="1321275062">
     <w:abstractNumId w:val="3"/>
+  </w:num>
+  <w:num w:numId="33" w16cid:durableId="494418993">
+    <w:abstractNumId w:val="22"/>
   </w:num>
 </w:numbering>
 </file>
@@ -15571,6 +15936,7 @@
   <w:style w:type="character" w:default="1" w:styleId="DefaultParagraphFont">
     <w:name w:val="Default Paragraph Font"/>
     <w:uiPriority w:val="1"/>
+    <w:semiHidden/>
     <w:unhideWhenUsed/>
   </w:style>
   <w:style w:type="table" w:default="1" w:styleId="TableNormal">
@@ -16572,32 +16938,6 @@
 </file>
 
 <file path=customXml/item1.xml><?xml version="1.0" encoding="utf-8"?>
-<p:properties xmlns:p="http://schemas.microsoft.com/office/2006/metadata/properties" xmlns:xsi="http://www.w3.org/2001/XMLSchema-instance" xmlns:pc="http://schemas.microsoft.com/office/infopath/2007/PartnerControls">
-  <documentManagement>
-    <SharedWithUsers xmlns="a156e92d-423a-4625-9818-f5e87239af8a">
-      <UserInfo>
-        <DisplayName/>
-        <AccountId xsi:nil="true"/>
-        <AccountType/>
-      </UserInfo>
-    </SharedWithUsers>
-    <lcf76f155ced4ddcb4097134ff3c332f xmlns="a60d0634-94da-4e6e-b36f-66eaaf0b6f4e">
-      <Terms xmlns="http://schemas.microsoft.com/office/infopath/2007/PartnerControls"/>
-    </lcf76f155ced4ddcb4097134ff3c332f>
-  </documentManagement>
-</p:properties>
-</file>
-
-<file path=customXml/item2.xml><?xml version="1.0" encoding="utf-8"?>
-<?mso-contentType ?>
-<FormTemplates xmlns="http://schemas.microsoft.com/sharepoint/v3/contenttype/forms">
-  <Display>DocumentLibraryForm</Display>
-  <Edit>DocumentLibraryForm</Edit>
-  <New>DocumentLibraryForm</New>
-</FormTemplates>
-</file>
-
-<file path=customXml/item3.xml><?xml version="1.0" encoding="utf-8"?>
 <ct:contentTypeSchema xmlns:ct="http://schemas.microsoft.com/office/2006/metadata/contentType" xmlns:ma="http://schemas.microsoft.com/office/2006/metadata/properties/metaAttributes" ct:_="" ma:_="" ma:contentTypeName="Document" ma:contentTypeID="0x010100F71F8A81E89B1E4A872028645FD1B6AE" ma:contentTypeVersion="11" ma:contentTypeDescription="Create a new document." ma:contentTypeScope="" ma:versionID="00e7a2aec32c88b8ca7efc9843325748">
   <xsd:schema xmlns:xsd="http://www.w3.org/2001/XMLSchema" xmlns:xs="http://www.w3.org/2001/XMLSchema" xmlns:p="http://schemas.microsoft.com/office/2006/metadata/properties" xmlns:ns2="a60d0634-94da-4e6e-b36f-66eaaf0b6f4e" xmlns:ns3="a156e92d-423a-4625-9818-f5e87239af8a" targetNamespace="http://schemas.microsoft.com/office/2006/metadata/properties" ma:root="true" ma:fieldsID="f6caa66f0c7935a35dae6e174e32ee4b" ns2:_="" ns3:_="">
     <xsd:import namespace="a60d0634-94da-4e6e-b36f-66eaaf0b6f4e"/>
@@ -16802,26 +17142,33 @@
 </ct:contentTypeSchema>
 </file>
 
-<file path=customXml/itemProps1.xml><?xml version="1.0" encoding="utf-8"?>
-<ds:datastoreItem xmlns:ds="http://schemas.openxmlformats.org/officeDocument/2006/customXml" ds:itemID="{E4B4D352-B35B-4B3A-95D2-902933709BD2}">
-  <ds:schemaRefs>
-    <ds:schemaRef ds:uri="http://schemas.microsoft.com/office/2006/metadata/properties"/>
-    <ds:schemaRef ds:uri="http://schemas.microsoft.com/office/infopath/2007/PartnerControls"/>
-    <ds:schemaRef ds:uri="a156e92d-423a-4625-9818-f5e87239af8a"/>
-    <ds:schemaRef ds:uri="a60d0634-94da-4e6e-b36f-66eaaf0b6f4e"/>
-  </ds:schemaRefs>
-</ds:datastoreItem>
+<file path=customXml/item2.xml><?xml version="1.0" encoding="utf-8"?>
+<?mso-contentType ?>
+<FormTemplates xmlns="http://schemas.microsoft.com/sharepoint/v3/contenttype/forms">
+  <Display>DocumentLibraryForm</Display>
+  <Edit>DocumentLibraryForm</Edit>
+  <New>DocumentLibraryForm</New>
+</FormTemplates>
 </file>
 
-<file path=customXml/itemProps2.xml><?xml version="1.0" encoding="utf-8"?>
-<ds:datastoreItem xmlns:ds="http://schemas.openxmlformats.org/officeDocument/2006/customXml" ds:itemID="{CEAD825D-2413-46BA-BB1F-DCE637B19B0C}">
-  <ds:schemaRefs>
-    <ds:schemaRef ds:uri="http://schemas.microsoft.com/sharepoint/v3/contenttype/forms"/>
-  </ds:schemaRefs>
-</ds:datastoreItem>
+<file path=customXml/item3.xml><?xml version="1.0" encoding="utf-8"?>
+<p:properties xmlns:p="http://schemas.microsoft.com/office/2006/metadata/properties" xmlns:xsi="http://www.w3.org/2001/XMLSchema-instance" xmlns:pc="http://schemas.microsoft.com/office/infopath/2007/PartnerControls">
+  <documentManagement>
+    <SharedWithUsers xmlns="a156e92d-423a-4625-9818-f5e87239af8a">
+      <UserInfo>
+        <DisplayName/>
+        <AccountId xsi:nil="true"/>
+        <AccountType/>
+      </UserInfo>
+    </SharedWithUsers>
+    <lcf76f155ced4ddcb4097134ff3c332f xmlns="a60d0634-94da-4e6e-b36f-66eaaf0b6f4e">
+      <Terms xmlns="http://schemas.microsoft.com/office/infopath/2007/PartnerControls"/>
+    </lcf76f155ced4ddcb4097134ff3c332f>
+  </documentManagement>
+</p:properties>
 </file>
 
-<file path=customXml/itemProps3.xml><?xml version="1.0" encoding="utf-8"?>
+<file path=customXml/itemProps1.xml><?xml version="1.0" encoding="utf-8"?>
 <ds:datastoreItem xmlns:ds="http://schemas.openxmlformats.org/officeDocument/2006/customXml" ds:itemID="{5C451799-F9B0-43E0-ABE9-80ABBAA59FE8}">
   <ds:schemaRefs>
     <ds:schemaRef ds:uri="http://schemas.microsoft.com/office/2006/metadata/contentType"/>
@@ -16838,4 +17185,23 @@
     <ds:schemaRef ds:uri="http://schemas.microsoft.com/internal/obd"/>
   </ds:schemaRefs>
 </ds:datastoreItem>
+</file>
+
+<file path=customXml/itemProps2.xml><?xml version="1.0" encoding="utf-8"?>
+<ds:datastoreItem xmlns:ds="http://schemas.openxmlformats.org/officeDocument/2006/customXml" ds:itemID="{CEAD825D-2413-46BA-BB1F-DCE637B19B0C}">
+  <ds:schemaRefs>
+    <ds:schemaRef ds:uri="http://schemas.microsoft.com/sharepoint/v3/contenttype/forms"/>
+  </ds:schemaRefs>
+</ds:datastoreItem>
+</file>
+
+<file path=customXml/itemProps3.xml><?xml version="1.0" encoding="utf-8"?>
+<ds:datastoreItem xmlns:ds="http://schemas.openxmlformats.org/officeDocument/2006/customXml" ds:itemID="{E4B4D352-B35B-4B3A-95D2-902933709BD2}">
+  <ds:schemaRefs>
+    <ds:schemaRef ds:uri="http://schemas.microsoft.com/office/2006/metadata/properties"/>
+    <ds:schemaRef ds:uri="http://schemas.microsoft.com/office/infopath/2007/PartnerControls"/>
+    <ds:schemaRef ds:uri="a156e92d-423a-4625-9818-f5e87239af8a"/>
+    <ds:schemaRef ds:uri="a60d0634-94da-4e6e-b36f-66eaaf0b6f4e"/>
+  </ds:schemaRefs>
+</ds:datastoreItem>
 </file>
</xml_diff>